<commit_message>
Cập nhật đồng bộ Lịch báo giảng Tuần 01 - 35 (toàn bộ 105 file docx)
</commit_message>
<xml_diff>
--- a/Hệ thống mẫu văn bản/Nguyên đã làm/Lịch báo giảng/Lịch báo giảng - Tuần 01 (THCS).docx
+++ b/Hệ thống mẫu văn bản/Nguyên đã làm/Lịch báo giảng/Lịch báo giảng - Tuần 01 (THCS).docx
@@ -424,7 +424,7 @@
         </w:rPr>
       </w:pPr>
       <w:r>
-        <w:t xml:space="preserve">                                                  TUẦN 01 (từ ngày 03/08/2026 đến ngày 07/08/2026)</w:t>
+        <w:t>TUẦN 01 (từ ngày 03/08/2026 đến ngày 07/08/2026)</w:t>
       </w:r>
     </w:p>
     <w:p>
@@ -450,58 +450,45 @@
         <w:rPr>
           <w:i/>
         </w:rPr>
-        <w:t>Buổi…</w:t>
+        <w:t>Buổi…sáng……..Tuần…01…(Từ ngày…03/08/2026 …đến ngày:… 07/08/2026….)</w:t>
       </w:r>
       <w:r>
         <w:rPr>
           <w:i/>
         </w:rPr>
-        <w:t>sáng</w:t>
       </w:r>
       <w:r>
         <w:rPr>
           <w:i/>
         </w:rPr>
-        <w:t>……..Tuần…</w:t>
       </w:r>
       <w:r>
         <w:rPr>
           <w:i/>
         </w:rPr>
-        <w:t>01</w:t>
       </w:r>
       <w:r>
         <w:rPr>
           <w:i/>
         </w:rPr>
-        <w:t>…(Từ ngày…</w:t>
       </w:r>
+      <w:r/>
       <w:r>
-        <w:t xml:space="preserve">03/08/2026 </w:t>
+        <w:rPr>
+          <w:i/>
+        </w:rPr>
+      </w:r>
+      <w:r/>
+      <w:r/>
+      <w:r>
+        <w:rPr>
+          <w:i/>
+        </w:rPr>
       </w:r>
       <w:r>
         <w:rPr>
           <w:i/>
         </w:rPr>
-        <w:t>…đến ngày:…</w:t>
-      </w:r>
-      <w:r>
-        <w:t xml:space="preserve"> </w:t>
-      </w:r>
-      <w:r>
-        <w:t>07/08/2026</w:t>
-      </w:r>
-      <w:r>
-        <w:rPr>
-          <w:i/>
-        </w:rPr>
-        <w:t>….)</w:t>
-      </w:r>
-      <w:r>
-        <w:rPr>
-          <w:i/>
-        </w:rPr>
-        <w:t xml:space="preserve">                                                                                           </w:t>
       </w:r>
     </w:p>
     <w:tbl>
@@ -5444,52 +5431,40 @@
         <w:rPr>
           <w:i/>
         </w:rPr>
-        <w:t>Buổi…</w:t>
+        <w:t>Buổi…chiều…..Tuần…01…(Từ ngày…03/08/2026…đến ngày:… 07/08/2026….)</w:t>
       </w:r>
       <w:r>
         <w:rPr>
           <w:i/>
         </w:rPr>
-        <w:t>chiều</w:t>
       </w:r>
       <w:r>
         <w:rPr>
           <w:i/>
         </w:rPr>
-        <w:t>…..Tuần…</w:t>
       </w:r>
       <w:r>
         <w:rPr>
           <w:i/>
         </w:rPr>
-        <w:t>01</w:t>
       </w:r>
       <w:r>
         <w:rPr>
           <w:i/>
         </w:rPr>
-        <w:t>…(Từ ngày…</w:t>
       </w:r>
-      <w:r>
-        <w:t>03/08/2026</w:t>
-      </w:r>
+      <w:r/>
       <w:r>
         <w:rPr>
           <w:i/>
         </w:rPr>
-        <w:t>…đến ngày:…</w:t>
       </w:r>
-      <w:r>
-        <w:t xml:space="preserve"> </w:t>
-      </w:r>
-      <w:r>
-        <w:t>07/08/2026</w:t>
-      </w:r>
+      <w:r/>
+      <w:r/>
       <w:r>
         <w:rPr>
           <w:i/>
         </w:rPr>
-        <w:t xml:space="preserve">….)                                                                                           </w:t>
       </w:r>
     </w:p>
     <w:tbl>

</xml_diff>

<commit_message>
feat(notebooklm & docs): Nap 11 tai lieu vao Bo nao NotebookLM UNIGO, cap nhat TKB giao vien, Ke hoach Van Mieu va Slide Tuan 04
</commit_message>
<xml_diff>
--- a/Hệ thống mẫu văn bản/Nguyên đã làm/Lịch báo giảng/Lịch báo giảng - Tuần 01 (THCS).docx
+++ b/Hệ thống mẫu văn bản/Nguyên đã làm/Lịch báo giảng/Lịch báo giảng - Tuần 01 (THCS).docx
@@ -2,420 +2,6 @@
 <file path=word/document.xml><?xml version="1.0" encoding="utf-8"?>
 <w:document xmlns:wpc="http://schemas.microsoft.com/office/word/2010/wordprocessingCanvas" xmlns:cx="http://schemas.microsoft.com/office/drawing/2014/chartex" xmlns:cx1="http://schemas.microsoft.com/office/drawing/2015/9/8/chartex" xmlns:cx2="http://schemas.microsoft.com/office/drawing/2015/10/21/chartex" xmlns:cx3="http://schemas.microsoft.com/office/drawing/2016/5/9/chartex" xmlns:cx4="http://schemas.microsoft.com/office/drawing/2016/5/10/chartex" xmlns:cx5="http://schemas.microsoft.com/office/drawing/2016/5/11/chartex" xmlns:cx6="http://schemas.microsoft.com/office/drawing/2016/5/12/chartex" xmlns:cx7="http://schemas.microsoft.com/office/drawing/2016/5/13/chartex" xmlns:cx8="http://schemas.microsoft.com/office/drawing/2016/5/14/chartex" xmlns:mc="http://schemas.openxmlformats.org/markup-compatibility/2006" xmlns:aink="http://schemas.microsoft.com/office/drawing/2016/ink" xmlns:am3d="http://schemas.microsoft.com/office/drawing/2017/model3d" xmlns:o="urn:schemas-microsoft-com:office:office" xmlns:oel="http://schemas.microsoft.com/office/2019/extlst" xmlns:r="http://schemas.openxmlformats.org/officeDocument/2006/relationships" xmlns:m="http://schemas.openxmlformats.org/officeDocument/2006/math" xmlns:v="urn:schemas-microsoft-com:vml" xmlns:wp14="http://schemas.microsoft.com/office/word/2010/wordprocessingDrawing" xmlns:wp="http://schemas.openxmlformats.org/drawingml/2006/wordprocessingDrawing" xmlns:w10="urn:schemas-microsoft-com:office:word" xmlns:w="http://schemas.openxmlformats.org/wordprocessingml/2006/main" xmlns:w14="http://schemas.microsoft.com/office/word/2010/wordml" xmlns:w15="http://schemas.microsoft.com/office/word/2012/wordml" xmlns:w16cei="http://schemas.microsoft.com/office/word/2026/wordml/cei" xmlns:w16cex="http://schemas.microsoft.com/office/word/2018/wordml/cex" xmlns:w16cid="http://schemas.microsoft.com/office/word/2016/wordml/cid" xmlns:w16="http://schemas.microsoft.com/office/word/2018/wordml" xmlns:w16du="http://schemas.microsoft.com/office/word/2023/wordml/word16du" xmlns:w16sdtdh="http://schemas.microsoft.com/office/word/2020/wordml/sdtdatahash" xmlns:w16sdtfl="http://schemas.microsoft.com/office/word/2024/wordml/sdtformatlock" xmlns:w16se="http://schemas.microsoft.com/office/word/2015/wordml/symex" xmlns:wpg="http://schemas.microsoft.com/office/word/2010/wordprocessingGroup" xmlns:wpi="http://schemas.microsoft.com/office/word/2010/wordprocessingInk" xmlns:wne="http://schemas.microsoft.com/office/word/2006/wordml" xmlns:wps="http://schemas.microsoft.com/office/word/2010/wordprocessingShape" mc:Ignorable="w14 w15 w16se w16cid w16 w16cex w16sdtdh w16sdtfl w16du wp14">
   <w:body>
-    <w:tbl>
-      <w:tblPr>
-        <w:tblStyle w:val="TableGrid"/>
-        <w:tblW w:w="0" w:type="auto"/>
-        <w:tblInd w:w="279" w:type="dxa"/>
-        <w:tblBorders>
-          <w:top w:val="single" w:sz="4" w:space="0" w:color="000000"/>
-          <w:left w:val="single" w:sz="4" w:space="0" w:color="000000"/>
-          <w:bottom w:val="single" w:sz="4" w:space="0" w:color="000000"/>
-          <w:right w:val="single" w:sz="4" w:space="0" w:color="000000"/>
-          <w:insideH w:val="single" w:sz="4" w:space="0" w:color="000000"/>
-          <w:insideV w:val="single" w:sz="4" w:space="0" w:color="000000"/>
-        </w:tblBorders>
-        <w:tblLook w:val="04A0" w:firstRow="1" w:lastRow="0" w:firstColumn="1" w:lastColumn="0" w:noHBand="0" w:noVBand="1"/>
-      </w:tblPr>
-      <w:tblGrid>
-        <w:gridCol w:w="9072"/>
-      </w:tblGrid>
-      <w:tr>
-        <w:trPr>
-          <w:trHeight w:val="13555"/>
-        </w:trPr>
-        <w:tc>
-          <w:tcPr>
-            <w:tcW w:w="9072" w:type="dxa"/>
-          </w:tcPr>
-          <w:p>
-            <w:pPr>
-              <w:jc w:val="center"/>
-              <w:rPr>
-                <w:rFonts w:ascii="Times New Roman" w:hAnsi="Times New Roman" w:cs="Times New Roman"/>
-                <w:sz w:val="26"/>
-                <w:szCs w:val="26"/>
-              </w:rPr>
-            </w:pPr>
-            <w:r>
-              <w:rPr>
-                <w:rFonts w:ascii="Times New Roman" w:hAnsi="Times New Roman" w:cs="Times New Roman"/>
-                <w:sz w:val="26"/>
-                <w:szCs w:val="26"/>
-              </w:rPr>
-              <w:t>Họ và tên giáo viên: Đậu Đình Nguyên</w:t>
-            </w:r>
-            <w:r>
-              <w:rPr>
-                <w:rFonts w:ascii="Times New Roman" w:hAnsi="Times New Roman" w:cs="Times New Roman"/>
-                <w:sz w:val="26"/>
-                <w:szCs w:val="26"/>
-              </w:rPr>
-              <w:br/>
-              <w:t xml:space="preserve">Ngày/tháng/năm sinh: 20/03/2004             </w:t>
-            </w:r>
-            <w:r>
-              <w:rPr>
-                <w:rFonts w:ascii="Times New Roman" w:hAnsi="Times New Roman" w:cs="Times New Roman"/>
-                <w:sz w:val="26"/>
-                <w:szCs w:val="26"/>
-              </w:rPr>
-              <w:br/>
-              <w:t xml:space="preserve">Ngày/tháng/năm vào ngành:   </w:t>
-            </w:r>
-            <w:r>
-              <w:rPr>
-                <w:rFonts w:ascii="Times New Roman" w:hAnsi="Times New Roman" w:cs="Times New Roman"/>
-                <w:sz w:val="26"/>
-                <w:szCs w:val="26"/>
-              </w:rPr>
-              <w:br/>
-              <w:t xml:space="preserve">Hệ đào tạo: Sư phạm Tin học(dạy Tin bằng Tiếng Anh)                             </w:t>
-            </w:r>
-            <w:r>
-              <w:rPr>
-                <w:rFonts w:ascii="Times New Roman" w:hAnsi="Times New Roman" w:cs="Times New Roman"/>
-                <w:sz w:val="26"/>
-                <w:szCs w:val="26"/>
-              </w:rPr>
-              <w:br/>
-              <w:t>Chức vụ hiện nay: Giáo viên Tin học</w:t>
-            </w:r>
-            <w:r>
-              <w:rPr>
-                <w:rFonts w:ascii="Times New Roman" w:hAnsi="Times New Roman" w:cs="Times New Roman"/>
-                <w:sz w:val="26"/>
-                <w:szCs w:val="26"/>
-              </w:rPr>
-              <w:br/>
-            </w:r>
-            <w:r>
-              <w:rPr>
-                <w:rFonts w:ascii="Times New Roman" w:hAnsi="Times New Roman" w:cs="Times New Roman"/>
-                <w:sz w:val="26"/>
-                <w:szCs w:val="26"/>
-              </w:rPr>
-              <w:br/>
-            </w:r>
-            <w:r>
-              <w:rPr>
-                <w:rFonts w:ascii="Times New Roman" w:hAnsi="Times New Roman" w:cs="Times New Roman"/>
-                <w:sz w:val="26"/>
-                <w:szCs w:val="26"/>
-              </w:rPr>
-              <w:br/>
-            </w:r>
-          </w:p>
-          <w:p>
-            <w:pPr>
-              <w:jc w:val="center"/>
-              <w:rPr>
-                <w:rFonts w:ascii="Times New Roman" w:hAnsi="Times New Roman" w:cs="Times New Roman"/>
-              </w:rPr>
-            </w:pPr>
-            <w:r>
-              <w:rPr>
-                <w:rFonts w:ascii="Times New Roman" w:hAnsi="Times New Roman" w:cs="Times New Roman"/>
-              </w:rPr>
-              <w:br/>
-            </w:r>
-            <w:r>
-              <w:rPr>
-                <w:rFonts w:ascii="Times New Roman" w:hAnsi="Times New Roman" w:cs="Times New Roman"/>
-                <w:b/>
-                <w:bCs/>
-                <w:sz w:val="40"/>
-                <w:szCs w:val="40"/>
-              </w:rPr>
-              <w:t>CÔNG TÁC GIẢNG DẠY</w:t>
-            </w:r>
-            <w:r>
-              <w:rPr>
-                <w:rFonts w:ascii="Times New Roman" w:hAnsi="Times New Roman" w:cs="Times New Roman"/>
-                <w:b/>
-                <w:bCs/>
-                <w:sz w:val="40"/>
-                <w:szCs w:val="40"/>
-              </w:rPr>
-              <w:br/>
-            </w:r>
-            <w:r>
-              <w:rPr>
-                <w:rFonts w:ascii="Times New Roman" w:hAnsi="Times New Roman" w:cs="Times New Roman"/>
-                <w:sz w:val="26"/>
-                <w:szCs w:val="26"/>
-              </w:rPr>
-              <w:t>Lớp: Tiền tiểu học, Lớp 1, 2, 3, 4, 5, 6, 7, 8</w:t>
-            </w:r>
-            <w:r>
-              <w:rPr>
-                <w:rFonts w:ascii="Times New Roman" w:hAnsi="Times New Roman" w:cs="Times New Roman"/>
-              </w:rPr>
-              <w:br/>
-            </w:r>
-            <w:r>
-              <w:rPr>
-                <w:rFonts w:ascii="Times New Roman" w:hAnsi="Times New Roman" w:cs="Times New Roman"/>
-              </w:rPr>
-              <w:br/>
-            </w:r>
-          </w:p>
-          <w:p>
-            <w:pPr>
-              <w:jc w:val="center"/>
-              <w:rPr>
-                <w:rFonts w:ascii="Times New Roman" w:hAnsi="Times New Roman" w:cs="Times New Roman"/>
-              </w:rPr>
-            </w:pPr>
-          </w:p>
-          <w:p>
-            <w:pPr>
-              <w:jc w:val="center"/>
-              <w:rPr>
-                <w:rFonts w:ascii="Times New Roman" w:hAnsi="Times New Roman" w:cs="Times New Roman"/>
-              </w:rPr>
-            </w:pPr>
-          </w:p>
-          <w:p>
-            <w:pPr>
-              <w:jc w:val="center"/>
-              <w:rPr>
-                <w:rFonts w:ascii="Times New Roman" w:hAnsi="Times New Roman" w:cs="Times New Roman"/>
-              </w:rPr>
-            </w:pPr>
-            <w:r>
-              <w:rPr>
-                <w:rFonts w:ascii="Times New Roman" w:hAnsi="Times New Roman" w:cs="Times New Roman"/>
-              </w:rPr>
-              <w:br/>
-            </w:r>
-            <w:r>
-              <w:rPr>
-                <w:rFonts w:ascii="Times New Roman" w:hAnsi="Times New Roman" w:cs="Times New Roman"/>
-                <w:b/>
-                <w:bCs/>
-                <w:sz w:val="40"/>
-                <w:szCs w:val="40"/>
-              </w:rPr>
-              <w:t>CÔNG TÁC KHÁC</w:t>
-            </w:r>
-            <w:r>
-              <w:rPr>
-                <w:rFonts w:ascii="Times New Roman" w:hAnsi="Times New Roman" w:cs="Times New Roman"/>
-              </w:rPr>
-              <w:br/>
-            </w:r>
-            <w:r>
-              <w:rPr>
-                <w:rFonts w:ascii="Times New Roman" w:hAnsi="Times New Roman" w:cs="Times New Roman"/>
-                <w:sz w:val="26"/>
-                <w:szCs w:val="26"/>
-              </w:rPr>
-              <w:t xml:space="preserve">- Công tác chủ nhiệm </w:t>
-            </w:r>
-            <w:r>
-              <w:rPr>
-                <w:rFonts w:ascii="Times New Roman" w:hAnsi="Times New Roman" w:cs="Times New Roman"/>
-                <w:sz w:val="26"/>
-                <w:szCs w:val="26"/>
-              </w:rPr>
-              <w:br/>
-              <w:t>- Công tác bán trú</w:t>
-            </w:r>
-            <w:r>
-              <w:rPr>
-                <w:rFonts w:ascii="Times New Roman" w:hAnsi="Times New Roman" w:cs="Times New Roman"/>
-                <w:sz w:val="26"/>
-                <w:szCs w:val="26"/>
-              </w:rPr>
-              <w:br/>
-              <w:t>- Hoạt động sự kiện của lớp trong năm</w:t>
-            </w:r>
-            <w:r>
-              <w:rPr>
-                <w:rFonts w:ascii="Times New Roman" w:hAnsi="Times New Roman" w:cs="Times New Roman"/>
-                <w:sz w:val="26"/>
-                <w:szCs w:val="26"/>
-              </w:rPr>
-              <w:br/>
-            </w:r>
-            <w:r>
-              <w:rPr>
-                <w:rFonts w:ascii="Times New Roman" w:hAnsi="Times New Roman" w:cs="Times New Roman"/>
-                <w:sz w:val="26"/>
-                <w:szCs w:val="26"/>
-              </w:rPr>
-              <w:br/>
-            </w:r>
-            <w:r>
-              <w:rPr>
-                <w:rFonts w:ascii="Times New Roman" w:hAnsi="Times New Roman" w:cs="Times New Roman"/>
-                <w:sz w:val="26"/>
-                <w:szCs w:val="26"/>
-              </w:rPr>
-              <w:br/>
-            </w:r>
-            <w:r>
-              <w:rPr>
-                <w:rFonts w:ascii="Times New Roman" w:hAnsi="Times New Roman" w:cs="Times New Roman"/>
-                <w:sz w:val="26"/>
-                <w:szCs w:val="26"/>
-              </w:rPr>
-              <w:br/>
-              <w:t xml:space="preserve">         </w:t>
-            </w:r>
-            <w:r>
-              <w:rPr>
-                <w:rFonts w:ascii="Times New Roman" w:hAnsi="Times New Roman" w:cs="Times New Roman"/>
-                <w:sz w:val="26"/>
-                <w:szCs w:val="26"/>
-              </w:rPr>
-              <w:br/>
-            </w:r>
-            <w:r>
-              <w:rPr>
-                <w:rFonts w:ascii="Times New Roman" w:hAnsi="Times New Roman" w:cs="Times New Roman"/>
-                <w:sz w:val="26"/>
-                <w:szCs w:val="26"/>
-              </w:rPr>
-              <w:br/>
-            </w:r>
-            <w:r>
-              <w:rPr>
-                <w:rFonts w:ascii="Times New Roman" w:hAnsi="Times New Roman" w:cs="Times New Roman"/>
-                <w:sz w:val="26"/>
-                <w:szCs w:val="26"/>
-              </w:rPr>
-              <w:br/>
-            </w:r>
-            <w:r>
-              <w:rPr>
-                <w:rFonts w:ascii="Times New Roman" w:hAnsi="Times New Roman" w:cs="Times New Roman"/>
-                <w:sz w:val="26"/>
-                <w:szCs w:val="26"/>
-              </w:rPr>
-              <w:br/>
-            </w:r>
-            <w:r>
-              <w:rPr>
-                <w:rFonts w:ascii="Times New Roman" w:hAnsi="Times New Roman" w:cs="Times New Roman"/>
-                <w:sz w:val="26"/>
-                <w:szCs w:val="26"/>
-              </w:rPr>
-              <w:br/>
-            </w:r>
-            <w:r>
-              <w:rPr>
-                <w:rFonts w:ascii="Times New Roman" w:hAnsi="Times New Roman" w:cs="Times New Roman"/>
-                <w:sz w:val="26"/>
-                <w:szCs w:val="26"/>
-              </w:rPr>
-              <w:br/>
-              <w:t xml:space="preserve">                                                           </w:t>
-            </w:r>
-            <w:r>
-              <w:rPr>
-                <w:rFonts w:ascii="Times New Roman" w:hAnsi="Times New Roman" w:cs="Times New Roman"/>
-                <w:sz w:val="26"/>
-                <w:szCs w:val="26"/>
-              </w:rPr>
-              <w:br/>
-              <w:t xml:space="preserve"> </w:t>
-            </w:r>
-            <w:r>
-              <w:rPr>
-                <w:rFonts w:ascii="Times New Roman" w:hAnsi="Times New Roman" w:cs="Times New Roman"/>
-                <w:sz w:val="26"/>
-                <w:szCs w:val="26"/>
-              </w:rPr>
-              <w:t xml:space="preserve">                                                                 </w:t>
-            </w:r>
-            <w:r>
-              <w:rPr>
-                <w:rFonts w:ascii="Times New Roman" w:hAnsi="Times New Roman" w:cs="Times New Roman"/>
-                <w:sz w:val="26"/>
-                <w:szCs w:val="26"/>
-              </w:rPr>
-              <w:t xml:space="preserve"> Hà Nội, ngày..... tháng..... năm </w:t>
-            </w:r>
-            <w:r>
-              <w:rPr>
-                <w:rFonts w:ascii="Times New Roman" w:hAnsi="Times New Roman" w:cs="Times New Roman"/>
-                <w:sz w:val="26"/>
-                <w:szCs w:val="26"/>
-              </w:rPr>
-              <w:t>2026</w:t>
-            </w:r>
-            <w:r>
-              <w:rPr>
-                <w:rFonts w:ascii="Times New Roman" w:hAnsi="Times New Roman" w:cs="Times New Roman"/>
-                <w:sz w:val="26"/>
-                <w:szCs w:val="26"/>
-              </w:rPr>
-              <w:br/>
-              <w:t xml:space="preserve">                                                                           Hiệu trưởng</w:t>
-            </w:r>
-            <w:r>
-              <w:rPr>
-                <w:rFonts w:ascii="Times New Roman" w:hAnsi="Times New Roman" w:cs="Times New Roman"/>
-                <w:sz w:val="26"/>
-                <w:szCs w:val="26"/>
-              </w:rPr>
-              <w:br/>
-              <w:t xml:space="preserve">                                                                         (ký tên, đóng dấu)</w:t>
-            </w:r>
-            <w:r>
-              <w:rPr>
-                <w:rFonts w:ascii="Times New Roman" w:hAnsi="Times New Roman" w:cs="Times New Roman"/>
-                <w:sz w:val="26"/>
-                <w:szCs w:val="26"/>
-              </w:rPr>
-              <w:br/>
-            </w:r>
-            <w:r>
-              <w:rPr>
-                <w:rFonts w:ascii="Times New Roman" w:hAnsi="Times New Roman" w:cs="Times New Roman"/>
-              </w:rPr>
-              <w:br/>
-            </w:r>
-            <w:r>
-              <w:rPr>
-                <w:rFonts w:ascii="Times New Roman" w:hAnsi="Times New Roman" w:cs="Times New Roman"/>
-              </w:rPr>
-              <w:br/>
-            </w:r>
-            <w:r>
-              <w:rPr>
-                <w:rFonts w:ascii="Times New Roman" w:hAnsi="Times New Roman" w:cs="Times New Roman"/>
-              </w:rPr>
-              <w:br/>
-            </w:r>
-            <w:r>
-              <w:rPr>
-                <w:rFonts w:ascii="Times New Roman" w:hAnsi="Times New Roman" w:cs="Times New Roman"/>
-              </w:rPr>
-              <w:br/>
-            </w:r>
-            <w:r>
-              <w:rPr>
-                <w:rFonts w:ascii="Times New Roman" w:hAnsi="Times New Roman" w:cs="Times New Roman"/>
-              </w:rPr>
-              <w:br/>
-            </w:r>
-          </w:p>
-        </w:tc>
-      </w:tr>
-    </w:tbl>
-    <w:p>
-      <w:pPr>
-        <w:spacing w:after="0" w:line="240" w:lineRule="auto"/>
-        <w:rPr>
-          <w:color w:val="000000"/>
-          <w:sz w:val="32"/>
-          <w:szCs w:val="32"/>
-        </w:rPr>
-      </w:pPr>
-    </w:p>
     <w:p>
       <w:pPr>
         <w:spacing w:after="0"/>
@@ -5740,30 +5326,29 @@
             </w:pPr>
             <w:r>
               <w:rPr>
-                <w:rFonts w:ascii="Times New Roman" w:hAnsi="Times New Roman" w:cs="Times New Roman"/>
-                <w:sz w:val="26"/>
-                <w:szCs w:val="26"/>
+                <w:rFonts w:ascii="Times New Roman" w:hAnsi="Times New Roman"/>
+                <w:sz w:val="26"/>
               </w:rPr>
               <w:t>Ngày 31 tháng 7 năm 2026</w:t>
-            </w:r>
-            <w:r>
-              <w:rPr>
-                <w:rFonts w:ascii="Times New Roman" w:hAnsi="Times New Roman" w:cs="Times New Roman"/>
-                <w:sz w:val="26"/>
-                <w:szCs w:val="26"/>
-              </w:rPr>
               <w:br/>
+            </w:r>
+            <w:r>
+              <w:rPr>
+                <w:rFonts w:ascii="Times New Roman" w:hAnsi="Times New Roman"/>
+                <w:sz w:val="26"/>
+              </w:rPr>
               <w:t>Tổ trưởng</w:t>
               <w:br/>
+              <w:br/>
+              <w:br/>
+              <w:br/>
+            </w:r>
+            <w:r>
+              <w:rPr>
+                <w:rFonts w:ascii="Times New Roman" w:hAnsi="Times New Roman"/>
+                <w:sz w:val="26"/>
+              </w:rPr>
               <w:t>Nguyễn Thị Ngọc Ánh</w:t>
-            </w:r>
-            <w:r>
-              <w:rPr>
-                <w:rFonts w:ascii="Times New Roman" w:hAnsi="Times New Roman" w:cs="Times New Roman"/>
-                <w:sz w:val="26"/>
-                <w:szCs w:val="26"/>
-              </w:rPr>
-              <w:br/>
             </w:r>
           </w:p>
         </w:tc>
@@ -11102,2125 +10687,34 @@
             </w:pPr>
             <w:r>
               <w:rPr>
-                <w:rFonts w:ascii="Times New Roman" w:hAnsi="Times New Roman" w:cs="Times New Roman"/>
-                <w:sz w:val="26"/>
-                <w:szCs w:val="26"/>
-              </w:rPr>
-              <w:t>Ngày   tháng  năm 2026</w:t>
-            </w:r>
-            <w:r>
-              <w:rPr>
-                <w:rFonts w:ascii="Times New Roman" w:hAnsi="Times New Roman" w:cs="Times New Roman"/>
-                <w:sz w:val="26"/>
-                <w:szCs w:val="26"/>
-              </w:rPr>
+                <w:rFonts w:ascii="Times New Roman" w:hAnsi="Times New Roman"/>
+                <w:sz w:val="26"/>
+              </w:rPr>
+              <w:t>Ngày 31 tháng 7 năm 2026</w:t>
               <w:br/>
+            </w:r>
+            <w:r>
+              <w:rPr>
+                <w:rFonts w:ascii="Times New Roman" w:hAnsi="Times New Roman"/>
+                <w:sz w:val="26"/>
+              </w:rPr>
               <w:t>Tổ trưởng</w:t>
               <w:br/>
+              <w:br/>
+              <w:br/>
+              <w:br/>
+            </w:r>
+            <w:r>
+              <w:rPr>
+                <w:rFonts w:ascii="Times New Roman" w:hAnsi="Times New Roman"/>
+                <w:sz w:val="26"/>
+              </w:rPr>
               <w:t>Nguyễn Thị Ngọc Ánh</w:t>
-            </w:r>
-            <w:r>
-              <w:rPr>
-                <w:rFonts w:ascii="Times New Roman" w:hAnsi="Times New Roman" w:cs="Times New Roman"/>
-                <w:sz w:val="26"/>
-                <w:szCs w:val="26"/>
-              </w:rPr>
-              <w:br/>
-              <w:t>(Ký tên, đóng dấu)</w:t>
             </w:r>
           </w:p>
         </w:tc>
       </w:tr>
     </w:tbl>
-    <w:p>
-      <w:r>
-        <w:br w:type="page"/>
-      </w:r>
-    </w:p>
-    <w:p>
-      <w:pPr>
-        <w:spacing w:after="0" w:line="240" w:lineRule="auto"/>
-        <w:rPr>
-          <w:b/>
-          <w:bCs/>
-          <w:color w:val="000000"/>
-          <w:sz w:val="28"/>
-          <w:szCs w:val="28"/>
-        </w:rPr>
-      </w:pPr>
-      <w:r>
-        <w:rPr>
-          <w:b/>
-          <w:bCs/>
-          <w:color w:val="000000"/>
-          <w:szCs w:val="28"/>
-        </w:rPr>
-        <w:t>Nhận xét của BGH hoặc tổ trưởng chuyên môn về tiến độ thực hiện chương trình</w:t>
-      </w:r>
-    </w:p>
-    <w:p>
-      <w:pPr>
-        <w:spacing w:after="0" w:line="240" w:lineRule="auto"/>
-        <w:rPr>
-          <w:b/>
-          <w:bCs/>
-          <w:color w:val="000000"/>
-          <w:sz w:val="28"/>
-          <w:szCs w:val="28"/>
-        </w:rPr>
-      </w:pPr>
-    </w:p>
-    <w:tbl>
-      <w:tblPr>
-        <w:tblStyle w:val="TableGrid"/>
-        <w:tblW w:w="0" w:type="auto"/>
-        <w:tblBorders>
-          <w:top w:val="single" w:sz="4" w:space="0" w:color="000000"/>
-          <w:left w:val="single" w:sz="4" w:space="0" w:color="000000"/>
-          <w:bottom w:val="single" w:sz="4" w:space="0" w:color="000000"/>
-          <w:right w:val="single" w:sz="4" w:space="0" w:color="000000"/>
-          <w:insideH w:val="single" w:sz="4" w:space="0" w:color="000000"/>
-          <w:insideV w:val="single" w:sz="4" w:space="0" w:color="000000"/>
-        </w:tblBorders>
-        <w:tblLook w:val="04A0" w:firstRow="1" w:lastRow="0" w:firstColumn="1" w:lastColumn="0" w:noHBand="0" w:noVBand="1"/>
-      </w:tblPr>
-      <w:tblGrid>
-        <w:gridCol w:w="1555"/>
-        <w:gridCol w:w="6237"/>
-        <w:gridCol w:w="2208"/>
-      </w:tblGrid>
-      <w:tr>
-        <w:tc>
-          <w:tcPr>
-            <w:tcW w:w="1555" w:type="dxa"/>
-          </w:tcPr>
-          <w:p>
-            <w:pPr>
-              <w:spacing w:line="276" w:lineRule="auto"/>
-              <w:jc w:val="center"/>
-              <w:rPr>
-                <w:rFonts w:cs="Times New Roman"/>
-                <w:b/>
-                <w:bCs/>
-                <w:color w:val="000000"/>
-                <w:szCs w:val="26"/>
-              </w:rPr>
-            </w:pPr>
-            <w:r>
-              <w:rPr>
-                <w:rFonts w:cs="Times New Roman"/>
-                <w:b/>
-                <w:bCs/>
-                <w:color w:val="000000"/>
-                <w:szCs w:val="26"/>
-              </w:rPr>
-              <w:t>Ngày/tháng</w:t>
-            </w:r>
-          </w:p>
-        </w:tc>
-        <w:tc>
-          <w:tcPr>
-            <w:tcW w:w="6237" w:type="dxa"/>
-          </w:tcPr>
-          <w:p>
-            <w:pPr>
-              <w:spacing w:line="276" w:lineRule="auto"/>
-              <w:jc w:val="center"/>
-              <w:rPr>
-                <w:rFonts w:cs="Times New Roman"/>
-                <w:b/>
-                <w:bCs/>
-                <w:color w:val="000000"/>
-                <w:szCs w:val="26"/>
-              </w:rPr>
-            </w:pPr>
-            <w:r>
-              <w:rPr>
-                <w:rFonts w:cs="Times New Roman"/>
-                <w:b/>
-                <w:bCs/>
-                <w:color w:val="000000"/>
-                <w:szCs w:val="26"/>
-              </w:rPr>
-              <w:t>Nhận xét</w:t>
-            </w:r>
-          </w:p>
-        </w:tc>
-        <w:tc>
-          <w:tcPr>
-            <w:tcW w:w="2208" w:type="dxa"/>
-          </w:tcPr>
-          <w:p>
-            <w:pPr>
-              <w:spacing w:line="276" w:lineRule="auto"/>
-              <w:jc w:val="center"/>
-              <w:rPr>
-                <w:rFonts w:cs="Times New Roman"/>
-                <w:b/>
-                <w:bCs/>
-                <w:color w:val="000000"/>
-                <w:szCs w:val="26"/>
-              </w:rPr>
-            </w:pPr>
-            <w:r>
-              <w:rPr>
-                <w:rFonts w:cs="Times New Roman"/>
-                <w:b/>
-                <w:bCs/>
-                <w:color w:val="000000"/>
-                <w:szCs w:val="26"/>
-              </w:rPr>
-              <w:t>Chữ ký</w:t>
-            </w:r>
-          </w:p>
-        </w:tc>
-      </w:tr>
-      <w:tr>
-        <w:tc>
-          <w:tcPr>
-            <w:tcW w:w="1555" w:type="dxa"/>
-          </w:tcPr>
-          <w:p>
-            <w:pPr>
-              <w:spacing w:line="276" w:lineRule="auto"/>
-              <w:rPr>
-                <w:rFonts w:cs="Times New Roman"/>
-                <w:b/>
-                <w:bCs/>
-                <w:color w:val="000000"/>
-                <w:szCs w:val="26"/>
-              </w:rPr>
-            </w:pPr>
-          </w:p>
-        </w:tc>
-        <w:tc>
-          <w:tcPr>
-            <w:tcW w:w="6237" w:type="dxa"/>
-          </w:tcPr>
-          <w:p>
-            <w:pPr>
-              <w:spacing w:line="276" w:lineRule="auto"/>
-              <w:rPr>
-                <w:rFonts w:cs="Times New Roman"/>
-                <w:b/>
-                <w:bCs/>
-                <w:color w:val="000000"/>
-                <w:szCs w:val="26"/>
-              </w:rPr>
-            </w:pPr>
-          </w:p>
-        </w:tc>
-        <w:tc>
-          <w:tcPr>
-            <w:tcW w:w="2208" w:type="dxa"/>
-          </w:tcPr>
-          <w:p>
-            <w:pPr>
-              <w:spacing w:line="276" w:lineRule="auto"/>
-              <w:rPr>
-                <w:rFonts w:cs="Times New Roman"/>
-                <w:b/>
-                <w:bCs/>
-                <w:color w:val="000000"/>
-                <w:szCs w:val="26"/>
-              </w:rPr>
-            </w:pPr>
-          </w:p>
-        </w:tc>
-      </w:tr>
-      <w:tr>
-        <w:tc>
-          <w:tcPr>
-            <w:tcW w:w="1555" w:type="dxa"/>
-          </w:tcPr>
-          <w:p>
-            <w:pPr>
-              <w:spacing w:line="276" w:lineRule="auto"/>
-              <w:rPr>
-                <w:b/>
-                <w:bCs/>
-                <w:color w:val="000000"/>
-              </w:rPr>
-            </w:pPr>
-          </w:p>
-        </w:tc>
-        <w:tc>
-          <w:tcPr>
-            <w:tcW w:w="6237" w:type="dxa"/>
-          </w:tcPr>
-          <w:p>
-            <w:pPr>
-              <w:spacing w:line="276" w:lineRule="auto"/>
-              <w:rPr>
-                <w:b/>
-                <w:bCs/>
-                <w:color w:val="000000"/>
-              </w:rPr>
-            </w:pPr>
-          </w:p>
-        </w:tc>
-        <w:tc>
-          <w:tcPr>
-            <w:tcW w:w="2208" w:type="dxa"/>
-          </w:tcPr>
-          <w:p>
-            <w:pPr>
-              <w:spacing w:line="276" w:lineRule="auto"/>
-              <w:rPr>
-                <w:b/>
-                <w:bCs/>
-                <w:color w:val="000000"/>
-              </w:rPr>
-            </w:pPr>
-          </w:p>
-        </w:tc>
-      </w:tr>
-      <w:tr>
-        <w:tc>
-          <w:tcPr>
-            <w:tcW w:w="1555" w:type="dxa"/>
-          </w:tcPr>
-          <w:p>
-            <w:pPr>
-              <w:spacing w:line="276" w:lineRule="auto"/>
-              <w:rPr>
-                <w:b/>
-                <w:bCs/>
-                <w:color w:val="000000"/>
-              </w:rPr>
-            </w:pPr>
-          </w:p>
-        </w:tc>
-        <w:tc>
-          <w:tcPr>
-            <w:tcW w:w="6237" w:type="dxa"/>
-          </w:tcPr>
-          <w:p>
-            <w:pPr>
-              <w:spacing w:line="276" w:lineRule="auto"/>
-              <w:rPr>
-                <w:b/>
-                <w:bCs/>
-                <w:color w:val="000000"/>
-              </w:rPr>
-            </w:pPr>
-          </w:p>
-        </w:tc>
-        <w:tc>
-          <w:tcPr>
-            <w:tcW w:w="2208" w:type="dxa"/>
-          </w:tcPr>
-          <w:p>
-            <w:pPr>
-              <w:spacing w:line="276" w:lineRule="auto"/>
-              <w:rPr>
-                <w:b/>
-                <w:bCs/>
-                <w:color w:val="000000"/>
-              </w:rPr>
-            </w:pPr>
-          </w:p>
-        </w:tc>
-      </w:tr>
-      <w:tr>
-        <w:tc>
-          <w:tcPr>
-            <w:tcW w:w="1555" w:type="dxa"/>
-          </w:tcPr>
-          <w:p>
-            <w:pPr>
-              <w:spacing w:line="276" w:lineRule="auto"/>
-              <w:rPr>
-                <w:b/>
-                <w:bCs/>
-                <w:color w:val="000000"/>
-              </w:rPr>
-            </w:pPr>
-          </w:p>
-        </w:tc>
-        <w:tc>
-          <w:tcPr>
-            <w:tcW w:w="6237" w:type="dxa"/>
-          </w:tcPr>
-          <w:p>
-            <w:pPr>
-              <w:spacing w:line="276" w:lineRule="auto"/>
-              <w:rPr>
-                <w:b/>
-                <w:bCs/>
-                <w:color w:val="000000"/>
-              </w:rPr>
-            </w:pPr>
-          </w:p>
-        </w:tc>
-        <w:tc>
-          <w:tcPr>
-            <w:tcW w:w="2208" w:type="dxa"/>
-          </w:tcPr>
-          <w:p>
-            <w:pPr>
-              <w:spacing w:line="276" w:lineRule="auto"/>
-              <w:rPr>
-                <w:b/>
-                <w:bCs/>
-                <w:color w:val="000000"/>
-              </w:rPr>
-            </w:pPr>
-          </w:p>
-        </w:tc>
-      </w:tr>
-      <w:tr>
-        <w:tc>
-          <w:tcPr>
-            <w:tcW w:w="1555" w:type="dxa"/>
-          </w:tcPr>
-          <w:p>
-            <w:pPr>
-              <w:spacing w:line="276" w:lineRule="auto"/>
-              <w:rPr>
-                <w:b/>
-                <w:bCs/>
-                <w:color w:val="000000"/>
-              </w:rPr>
-            </w:pPr>
-          </w:p>
-        </w:tc>
-        <w:tc>
-          <w:tcPr>
-            <w:tcW w:w="6237" w:type="dxa"/>
-          </w:tcPr>
-          <w:p>
-            <w:pPr>
-              <w:spacing w:line="276" w:lineRule="auto"/>
-              <w:rPr>
-                <w:b/>
-                <w:bCs/>
-                <w:color w:val="000000"/>
-              </w:rPr>
-            </w:pPr>
-          </w:p>
-        </w:tc>
-        <w:tc>
-          <w:tcPr>
-            <w:tcW w:w="2208" w:type="dxa"/>
-          </w:tcPr>
-          <w:p>
-            <w:pPr>
-              <w:spacing w:line="276" w:lineRule="auto"/>
-              <w:rPr>
-                <w:b/>
-                <w:bCs/>
-                <w:color w:val="000000"/>
-              </w:rPr>
-            </w:pPr>
-          </w:p>
-        </w:tc>
-      </w:tr>
-      <w:tr>
-        <w:tc>
-          <w:tcPr>
-            <w:tcW w:w="1555" w:type="dxa"/>
-          </w:tcPr>
-          <w:p>
-            <w:pPr>
-              <w:spacing w:line="276" w:lineRule="auto"/>
-              <w:rPr>
-                <w:b/>
-                <w:bCs/>
-                <w:color w:val="000000"/>
-              </w:rPr>
-            </w:pPr>
-          </w:p>
-        </w:tc>
-        <w:tc>
-          <w:tcPr>
-            <w:tcW w:w="6237" w:type="dxa"/>
-          </w:tcPr>
-          <w:p>
-            <w:pPr>
-              <w:spacing w:line="276" w:lineRule="auto"/>
-              <w:rPr>
-                <w:b/>
-                <w:bCs/>
-                <w:color w:val="000000"/>
-              </w:rPr>
-            </w:pPr>
-          </w:p>
-        </w:tc>
-        <w:tc>
-          <w:tcPr>
-            <w:tcW w:w="2208" w:type="dxa"/>
-          </w:tcPr>
-          <w:p>
-            <w:pPr>
-              <w:spacing w:line="276" w:lineRule="auto"/>
-              <w:rPr>
-                <w:b/>
-                <w:bCs/>
-                <w:color w:val="000000"/>
-              </w:rPr>
-            </w:pPr>
-          </w:p>
-        </w:tc>
-      </w:tr>
-      <w:tr>
-        <w:tc>
-          <w:tcPr>
-            <w:tcW w:w="1555" w:type="dxa"/>
-          </w:tcPr>
-          <w:p>
-            <w:pPr>
-              <w:spacing w:line="276" w:lineRule="auto"/>
-              <w:rPr>
-                <w:b/>
-                <w:bCs/>
-                <w:color w:val="000000"/>
-              </w:rPr>
-            </w:pPr>
-          </w:p>
-        </w:tc>
-        <w:tc>
-          <w:tcPr>
-            <w:tcW w:w="6237" w:type="dxa"/>
-          </w:tcPr>
-          <w:p>
-            <w:pPr>
-              <w:spacing w:line="276" w:lineRule="auto"/>
-              <w:rPr>
-                <w:b/>
-                <w:bCs/>
-                <w:color w:val="000000"/>
-              </w:rPr>
-            </w:pPr>
-          </w:p>
-        </w:tc>
-        <w:tc>
-          <w:tcPr>
-            <w:tcW w:w="2208" w:type="dxa"/>
-          </w:tcPr>
-          <w:p>
-            <w:pPr>
-              <w:spacing w:line="276" w:lineRule="auto"/>
-              <w:rPr>
-                <w:b/>
-                <w:bCs/>
-                <w:color w:val="000000"/>
-              </w:rPr>
-            </w:pPr>
-          </w:p>
-        </w:tc>
-      </w:tr>
-      <w:tr>
-        <w:tc>
-          <w:tcPr>
-            <w:tcW w:w="1555" w:type="dxa"/>
-          </w:tcPr>
-          <w:p>
-            <w:pPr>
-              <w:spacing w:line="276" w:lineRule="auto"/>
-              <w:rPr>
-                <w:b/>
-                <w:bCs/>
-                <w:color w:val="000000"/>
-              </w:rPr>
-            </w:pPr>
-          </w:p>
-        </w:tc>
-        <w:tc>
-          <w:tcPr>
-            <w:tcW w:w="6237" w:type="dxa"/>
-          </w:tcPr>
-          <w:p>
-            <w:pPr>
-              <w:spacing w:line="276" w:lineRule="auto"/>
-              <w:rPr>
-                <w:b/>
-                <w:bCs/>
-                <w:color w:val="000000"/>
-              </w:rPr>
-            </w:pPr>
-          </w:p>
-        </w:tc>
-        <w:tc>
-          <w:tcPr>
-            <w:tcW w:w="2208" w:type="dxa"/>
-          </w:tcPr>
-          <w:p>
-            <w:pPr>
-              <w:spacing w:line="276" w:lineRule="auto"/>
-              <w:rPr>
-                <w:b/>
-                <w:bCs/>
-                <w:color w:val="000000"/>
-              </w:rPr>
-            </w:pPr>
-          </w:p>
-        </w:tc>
-      </w:tr>
-      <w:tr>
-        <w:tc>
-          <w:tcPr>
-            <w:tcW w:w="1555" w:type="dxa"/>
-          </w:tcPr>
-          <w:p>
-            <w:pPr>
-              <w:spacing w:line="276" w:lineRule="auto"/>
-              <w:rPr>
-                <w:b/>
-                <w:bCs/>
-                <w:color w:val="000000"/>
-              </w:rPr>
-            </w:pPr>
-          </w:p>
-        </w:tc>
-        <w:tc>
-          <w:tcPr>
-            <w:tcW w:w="6237" w:type="dxa"/>
-          </w:tcPr>
-          <w:p>
-            <w:pPr>
-              <w:spacing w:line="276" w:lineRule="auto"/>
-              <w:rPr>
-                <w:b/>
-                <w:bCs/>
-                <w:color w:val="000000"/>
-              </w:rPr>
-            </w:pPr>
-          </w:p>
-        </w:tc>
-        <w:tc>
-          <w:tcPr>
-            <w:tcW w:w="2208" w:type="dxa"/>
-          </w:tcPr>
-          <w:p>
-            <w:pPr>
-              <w:spacing w:line="276" w:lineRule="auto"/>
-              <w:rPr>
-                <w:b/>
-                <w:bCs/>
-                <w:color w:val="000000"/>
-              </w:rPr>
-            </w:pPr>
-          </w:p>
-        </w:tc>
-      </w:tr>
-      <w:tr>
-        <w:tc>
-          <w:tcPr>
-            <w:tcW w:w="1555" w:type="dxa"/>
-          </w:tcPr>
-          <w:p>
-            <w:pPr>
-              <w:spacing w:line="276" w:lineRule="auto"/>
-              <w:rPr>
-                <w:b/>
-                <w:bCs/>
-                <w:color w:val="000000"/>
-              </w:rPr>
-            </w:pPr>
-          </w:p>
-        </w:tc>
-        <w:tc>
-          <w:tcPr>
-            <w:tcW w:w="6237" w:type="dxa"/>
-          </w:tcPr>
-          <w:p>
-            <w:pPr>
-              <w:spacing w:line="276" w:lineRule="auto"/>
-              <w:rPr>
-                <w:b/>
-                <w:bCs/>
-                <w:color w:val="000000"/>
-              </w:rPr>
-            </w:pPr>
-          </w:p>
-        </w:tc>
-        <w:tc>
-          <w:tcPr>
-            <w:tcW w:w="2208" w:type="dxa"/>
-          </w:tcPr>
-          <w:p>
-            <w:pPr>
-              <w:spacing w:line="276" w:lineRule="auto"/>
-              <w:rPr>
-                <w:b/>
-                <w:bCs/>
-                <w:color w:val="000000"/>
-              </w:rPr>
-            </w:pPr>
-          </w:p>
-        </w:tc>
-      </w:tr>
-      <w:tr>
-        <w:tc>
-          <w:tcPr>
-            <w:tcW w:w="1555" w:type="dxa"/>
-          </w:tcPr>
-          <w:p>
-            <w:pPr>
-              <w:spacing w:line="276" w:lineRule="auto"/>
-              <w:rPr>
-                <w:b/>
-                <w:bCs/>
-                <w:color w:val="000000"/>
-              </w:rPr>
-            </w:pPr>
-          </w:p>
-        </w:tc>
-        <w:tc>
-          <w:tcPr>
-            <w:tcW w:w="6237" w:type="dxa"/>
-          </w:tcPr>
-          <w:p>
-            <w:pPr>
-              <w:spacing w:line="276" w:lineRule="auto"/>
-              <w:rPr>
-                <w:b/>
-                <w:bCs/>
-                <w:color w:val="000000"/>
-              </w:rPr>
-            </w:pPr>
-          </w:p>
-        </w:tc>
-        <w:tc>
-          <w:tcPr>
-            <w:tcW w:w="2208" w:type="dxa"/>
-          </w:tcPr>
-          <w:p>
-            <w:pPr>
-              <w:spacing w:line="276" w:lineRule="auto"/>
-              <w:rPr>
-                <w:b/>
-                <w:bCs/>
-                <w:color w:val="000000"/>
-              </w:rPr>
-            </w:pPr>
-          </w:p>
-        </w:tc>
-      </w:tr>
-      <w:tr>
-        <w:tc>
-          <w:tcPr>
-            <w:tcW w:w="1555" w:type="dxa"/>
-          </w:tcPr>
-          <w:p>
-            <w:pPr>
-              <w:spacing w:line="276" w:lineRule="auto"/>
-              <w:rPr>
-                <w:b/>
-                <w:bCs/>
-                <w:color w:val="000000"/>
-              </w:rPr>
-            </w:pPr>
-          </w:p>
-        </w:tc>
-        <w:tc>
-          <w:tcPr>
-            <w:tcW w:w="6237" w:type="dxa"/>
-          </w:tcPr>
-          <w:p>
-            <w:pPr>
-              <w:spacing w:line="276" w:lineRule="auto"/>
-              <w:rPr>
-                <w:b/>
-                <w:bCs/>
-                <w:color w:val="000000"/>
-              </w:rPr>
-            </w:pPr>
-          </w:p>
-        </w:tc>
-        <w:tc>
-          <w:tcPr>
-            <w:tcW w:w="2208" w:type="dxa"/>
-          </w:tcPr>
-          <w:p>
-            <w:pPr>
-              <w:spacing w:line="276" w:lineRule="auto"/>
-              <w:rPr>
-                <w:b/>
-                <w:bCs/>
-                <w:color w:val="000000"/>
-              </w:rPr>
-            </w:pPr>
-          </w:p>
-        </w:tc>
-      </w:tr>
-      <w:tr>
-        <w:tc>
-          <w:tcPr>
-            <w:tcW w:w="1555" w:type="dxa"/>
-          </w:tcPr>
-          <w:p>
-            <w:pPr>
-              <w:spacing w:line="276" w:lineRule="auto"/>
-              <w:rPr>
-                <w:b/>
-                <w:bCs/>
-                <w:color w:val="000000"/>
-              </w:rPr>
-            </w:pPr>
-          </w:p>
-        </w:tc>
-        <w:tc>
-          <w:tcPr>
-            <w:tcW w:w="6237" w:type="dxa"/>
-          </w:tcPr>
-          <w:p>
-            <w:pPr>
-              <w:spacing w:line="276" w:lineRule="auto"/>
-              <w:rPr>
-                <w:b/>
-                <w:bCs/>
-                <w:color w:val="000000"/>
-              </w:rPr>
-            </w:pPr>
-          </w:p>
-        </w:tc>
-        <w:tc>
-          <w:tcPr>
-            <w:tcW w:w="2208" w:type="dxa"/>
-          </w:tcPr>
-          <w:p>
-            <w:pPr>
-              <w:spacing w:line="276" w:lineRule="auto"/>
-              <w:rPr>
-                <w:b/>
-                <w:bCs/>
-                <w:color w:val="000000"/>
-              </w:rPr>
-            </w:pPr>
-          </w:p>
-        </w:tc>
-      </w:tr>
-      <w:tr>
-        <w:tc>
-          <w:tcPr>
-            <w:tcW w:w="1555" w:type="dxa"/>
-          </w:tcPr>
-          <w:p>
-            <w:pPr>
-              <w:spacing w:line="276" w:lineRule="auto"/>
-              <w:rPr>
-                <w:b/>
-                <w:bCs/>
-                <w:color w:val="000000"/>
-              </w:rPr>
-            </w:pPr>
-          </w:p>
-        </w:tc>
-        <w:tc>
-          <w:tcPr>
-            <w:tcW w:w="6237" w:type="dxa"/>
-          </w:tcPr>
-          <w:p>
-            <w:pPr>
-              <w:spacing w:line="276" w:lineRule="auto"/>
-              <w:rPr>
-                <w:b/>
-                <w:bCs/>
-                <w:color w:val="000000"/>
-              </w:rPr>
-            </w:pPr>
-          </w:p>
-        </w:tc>
-        <w:tc>
-          <w:tcPr>
-            <w:tcW w:w="2208" w:type="dxa"/>
-          </w:tcPr>
-          <w:p>
-            <w:pPr>
-              <w:spacing w:line="276" w:lineRule="auto"/>
-              <w:rPr>
-                <w:b/>
-                <w:bCs/>
-                <w:color w:val="000000"/>
-              </w:rPr>
-            </w:pPr>
-          </w:p>
-        </w:tc>
-      </w:tr>
-      <w:tr>
-        <w:tc>
-          <w:tcPr>
-            <w:tcW w:w="1555" w:type="dxa"/>
-          </w:tcPr>
-          <w:p>
-            <w:pPr>
-              <w:spacing w:line="276" w:lineRule="auto"/>
-              <w:rPr>
-                <w:b/>
-                <w:bCs/>
-                <w:color w:val="000000"/>
-              </w:rPr>
-            </w:pPr>
-          </w:p>
-        </w:tc>
-        <w:tc>
-          <w:tcPr>
-            <w:tcW w:w="6237" w:type="dxa"/>
-          </w:tcPr>
-          <w:p>
-            <w:pPr>
-              <w:spacing w:line="276" w:lineRule="auto"/>
-              <w:rPr>
-                <w:b/>
-                <w:bCs/>
-                <w:color w:val="000000"/>
-              </w:rPr>
-            </w:pPr>
-          </w:p>
-        </w:tc>
-        <w:tc>
-          <w:tcPr>
-            <w:tcW w:w="2208" w:type="dxa"/>
-          </w:tcPr>
-          <w:p>
-            <w:pPr>
-              <w:spacing w:line="276" w:lineRule="auto"/>
-              <w:rPr>
-                <w:b/>
-                <w:bCs/>
-                <w:color w:val="000000"/>
-              </w:rPr>
-            </w:pPr>
-          </w:p>
-        </w:tc>
-      </w:tr>
-      <w:tr>
-        <w:tc>
-          <w:tcPr>
-            <w:tcW w:w="1555" w:type="dxa"/>
-          </w:tcPr>
-          <w:p>
-            <w:pPr>
-              <w:spacing w:line="276" w:lineRule="auto"/>
-              <w:rPr>
-                <w:b/>
-                <w:bCs/>
-                <w:color w:val="000000"/>
-              </w:rPr>
-            </w:pPr>
-          </w:p>
-        </w:tc>
-        <w:tc>
-          <w:tcPr>
-            <w:tcW w:w="6237" w:type="dxa"/>
-          </w:tcPr>
-          <w:p>
-            <w:pPr>
-              <w:spacing w:line="276" w:lineRule="auto"/>
-              <w:rPr>
-                <w:b/>
-                <w:bCs/>
-                <w:color w:val="000000"/>
-              </w:rPr>
-            </w:pPr>
-          </w:p>
-        </w:tc>
-        <w:tc>
-          <w:tcPr>
-            <w:tcW w:w="2208" w:type="dxa"/>
-          </w:tcPr>
-          <w:p>
-            <w:pPr>
-              <w:spacing w:line="276" w:lineRule="auto"/>
-              <w:rPr>
-                <w:b/>
-                <w:bCs/>
-                <w:color w:val="000000"/>
-              </w:rPr>
-            </w:pPr>
-          </w:p>
-        </w:tc>
-      </w:tr>
-      <w:tr>
-        <w:tc>
-          <w:tcPr>
-            <w:tcW w:w="1555" w:type="dxa"/>
-          </w:tcPr>
-          <w:p>
-            <w:pPr>
-              <w:spacing w:line="276" w:lineRule="auto"/>
-              <w:rPr>
-                <w:b/>
-                <w:bCs/>
-                <w:color w:val="000000"/>
-              </w:rPr>
-            </w:pPr>
-          </w:p>
-        </w:tc>
-        <w:tc>
-          <w:tcPr>
-            <w:tcW w:w="6237" w:type="dxa"/>
-          </w:tcPr>
-          <w:p>
-            <w:pPr>
-              <w:spacing w:line="276" w:lineRule="auto"/>
-              <w:rPr>
-                <w:b/>
-                <w:bCs/>
-                <w:color w:val="000000"/>
-              </w:rPr>
-            </w:pPr>
-          </w:p>
-        </w:tc>
-        <w:tc>
-          <w:tcPr>
-            <w:tcW w:w="2208" w:type="dxa"/>
-          </w:tcPr>
-          <w:p>
-            <w:pPr>
-              <w:spacing w:line="276" w:lineRule="auto"/>
-              <w:rPr>
-                <w:b/>
-                <w:bCs/>
-                <w:color w:val="000000"/>
-              </w:rPr>
-            </w:pPr>
-          </w:p>
-        </w:tc>
-      </w:tr>
-      <w:tr>
-        <w:tc>
-          <w:tcPr>
-            <w:tcW w:w="1555" w:type="dxa"/>
-          </w:tcPr>
-          <w:p>
-            <w:pPr>
-              <w:spacing w:line="276" w:lineRule="auto"/>
-              <w:rPr>
-                <w:b/>
-                <w:bCs/>
-                <w:color w:val="000000"/>
-              </w:rPr>
-            </w:pPr>
-          </w:p>
-        </w:tc>
-        <w:tc>
-          <w:tcPr>
-            <w:tcW w:w="6237" w:type="dxa"/>
-          </w:tcPr>
-          <w:p>
-            <w:pPr>
-              <w:spacing w:line="276" w:lineRule="auto"/>
-              <w:rPr>
-                <w:b/>
-                <w:bCs/>
-                <w:color w:val="000000"/>
-              </w:rPr>
-            </w:pPr>
-          </w:p>
-        </w:tc>
-        <w:tc>
-          <w:tcPr>
-            <w:tcW w:w="2208" w:type="dxa"/>
-          </w:tcPr>
-          <w:p>
-            <w:pPr>
-              <w:spacing w:line="276" w:lineRule="auto"/>
-              <w:rPr>
-                <w:b/>
-                <w:bCs/>
-                <w:color w:val="000000"/>
-              </w:rPr>
-            </w:pPr>
-          </w:p>
-        </w:tc>
-      </w:tr>
-      <w:tr>
-        <w:tc>
-          <w:tcPr>
-            <w:tcW w:w="1555" w:type="dxa"/>
-          </w:tcPr>
-          <w:p>
-            <w:pPr>
-              <w:spacing w:line="276" w:lineRule="auto"/>
-              <w:rPr>
-                <w:b/>
-                <w:bCs/>
-                <w:color w:val="000000"/>
-              </w:rPr>
-            </w:pPr>
-          </w:p>
-        </w:tc>
-        <w:tc>
-          <w:tcPr>
-            <w:tcW w:w="6237" w:type="dxa"/>
-          </w:tcPr>
-          <w:p>
-            <w:pPr>
-              <w:spacing w:line="276" w:lineRule="auto"/>
-              <w:rPr>
-                <w:b/>
-                <w:bCs/>
-                <w:color w:val="000000"/>
-              </w:rPr>
-            </w:pPr>
-          </w:p>
-        </w:tc>
-        <w:tc>
-          <w:tcPr>
-            <w:tcW w:w="2208" w:type="dxa"/>
-          </w:tcPr>
-          <w:p>
-            <w:pPr>
-              <w:spacing w:line="276" w:lineRule="auto"/>
-              <w:rPr>
-                <w:b/>
-                <w:bCs/>
-                <w:color w:val="000000"/>
-              </w:rPr>
-            </w:pPr>
-          </w:p>
-        </w:tc>
-      </w:tr>
-      <w:tr>
-        <w:tc>
-          <w:tcPr>
-            <w:tcW w:w="1555" w:type="dxa"/>
-          </w:tcPr>
-          <w:p>
-            <w:pPr>
-              <w:spacing w:line="276" w:lineRule="auto"/>
-              <w:rPr>
-                <w:b/>
-                <w:bCs/>
-                <w:color w:val="000000"/>
-              </w:rPr>
-            </w:pPr>
-          </w:p>
-        </w:tc>
-        <w:tc>
-          <w:tcPr>
-            <w:tcW w:w="6237" w:type="dxa"/>
-          </w:tcPr>
-          <w:p>
-            <w:pPr>
-              <w:spacing w:line="276" w:lineRule="auto"/>
-              <w:rPr>
-                <w:b/>
-                <w:bCs/>
-                <w:color w:val="000000"/>
-              </w:rPr>
-            </w:pPr>
-          </w:p>
-        </w:tc>
-        <w:tc>
-          <w:tcPr>
-            <w:tcW w:w="2208" w:type="dxa"/>
-          </w:tcPr>
-          <w:p>
-            <w:pPr>
-              <w:spacing w:line="276" w:lineRule="auto"/>
-              <w:rPr>
-                <w:b/>
-                <w:bCs/>
-                <w:color w:val="000000"/>
-              </w:rPr>
-            </w:pPr>
-          </w:p>
-        </w:tc>
-      </w:tr>
-      <w:tr>
-        <w:tc>
-          <w:tcPr>
-            <w:tcW w:w="1555" w:type="dxa"/>
-          </w:tcPr>
-          <w:p>
-            <w:pPr>
-              <w:spacing w:line="276" w:lineRule="auto"/>
-              <w:rPr>
-                <w:b/>
-                <w:bCs/>
-                <w:color w:val="000000"/>
-              </w:rPr>
-            </w:pPr>
-          </w:p>
-        </w:tc>
-        <w:tc>
-          <w:tcPr>
-            <w:tcW w:w="6237" w:type="dxa"/>
-          </w:tcPr>
-          <w:p>
-            <w:pPr>
-              <w:spacing w:line="276" w:lineRule="auto"/>
-              <w:rPr>
-                <w:b/>
-                <w:bCs/>
-                <w:color w:val="000000"/>
-              </w:rPr>
-            </w:pPr>
-          </w:p>
-        </w:tc>
-        <w:tc>
-          <w:tcPr>
-            <w:tcW w:w="2208" w:type="dxa"/>
-          </w:tcPr>
-          <w:p>
-            <w:pPr>
-              <w:spacing w:line="276" w:lineRule="auto"/>
-              <w:rPr>
-                <w:b/>
-                <w:bCs/>
-                <w:color w:val="000000"/>
-              </w:rPr>
-            </w:pPr>
-          </w:p>
-        </w:tc>
-      </w:tr>
-      <w:tr>
-        <w:tc>
-          <w:tcPr>
-            <w:tcW w:w="1555" w:type="dxa"/>
-          </w:tcPr>
-          <w:p>
-            <w:pPr>
-              <w:spacing w:line="276" w:lineRule="auto"/>
-              <w:rPr>
-                <w:b/>
-                <w:bCs/>
-                <w:color w:val="000000"/>
-              </w:rPr>
-            </w:pPr>
-          </w:p>
-        </w:tc>
-        <w:tc>
-          <w:tcPr>
-            <w:tcW w:w="6237" w:type="dxa"/>
-          </w:tcPr>
-          <w:p>
-            <w:pPr>
-              <w:spacing w:line="276" w:lineRule="auto"/>
-              <w:rPr>
-                <w:b/>
-                <w:bCs/>
-                <w:color w:val="000000"/>
-              </w:rPr>
-            </w:pPr>
-          </w:p>
-        </w:tc>
-        <w:tc>
-          <w:tcPr>
-            <w:tcW w:w="2208" w:type="dxa"/>
-          </w:tcPr>
-          <w:p>
-            <w:pPr>
-              <w:spacing w:line="276" w:lineRule="auto"/>
-              <w:rPr>
-                <w:b/>
-                <w:bCs/>
-                <w:color w:val="000000"/>
-              </w:rPr>
-            </w:pPr>
-          </w:p>
-        </w:tc>
-      </w:tr>
-      <w:tr>
-        <w:tc>
-          <w:tcPr>
-            <w:tcW w:w="1555" w:type="dxa"/>
-          </w:tcPr>
-          <w:p>
-            <w:pPr>
-              <w:spacing w:line="276" w:lineRule="auto"/>
-              <w:rPr>
-                <w:b/>
-                <w:bCs/>
-                <w:color w:val="000000"/>
-              </w:rPr>
-            </w:pPr>
-          </w:p>
-        </w:tc>
-        <w:tc>
-          <w:tcPr>
-            <w:tcW w:w="6237" w:type="dxa"/>
-          </w:tcPr>
-          <w:p>
-            <w:pPr>
-              <w:spacing w:line="276" w:lineRule="auto"/>
-              <w:rPr>
-                <w:b/>
-                <w:bCs/>
-                <w:color w:val="000000"/>
-              </w:rPr>
-            </w:pPr>
-          </w:p>
-        </w:tc>
-        <w:tc>
-          <w:tcPr>
-            <w:tcW w:w="2208" w:type="dxa"/>
-          </w:tcPr>
-          <w:p>
-            <w:pPr>
-              <w:spacing w:line="276" w:lineRule="auto"/>
-              <w:rPr>
-                <w:b/>
-                <w:bCs/>
-                <w:color w:val="000000"/>
-              </w:rPr>
-            </w:pPr>
-          </w:p>
-        </w:tc>
-      </w:tr>
-      <w:tr>
-        <w:tc>
-          <w:tcPr>
-            <w:tcW w:w="1555" w:type="dxa"/>
-          </w:tcPr>
-          <w:p>
-            <w:pPr>
-              <w:spacing w:line="276" w:lineRule="auto"/>
-              <w:rPr>
-                <w:b/>
-                <w:bCs/>
-                <w:color w:val="000000"/>
-              </w:rPr>
-            </w:pPr>
-          </w:p>
-        </w:tc>
-        <w:tc>
-          <w:tcPr>
-            <w:tcW w:w="6237" w:type="dxa"/>
-          </w:tcPr>
-          <w:p>
-            <w:pPr>
-              <w:spacing w:line="276" w:lineRule="auto"/>
-              <w:rPr>
-                <w:b/>
-                <w:bCs/>
-                <w:color w:val="000000"/>
-              </w:rPr>
-            </w:pPr>
-          </w:p>
-        </w:tc>
-        <w:tc>
-          <w:tcPr>
-            <w:tcW w:w="2208" w:type="dxa"/>
-          </w:tcPr>
-          <w:p>
-            <w:pPr>
-              <w:spacing w:line="276" w:lineRule="auto"/>
-              <w:rPr>
-                <w:b/>
-                <w:bCs/>
-                <w:color w:val="000000"/>
-              </w:rPr>
-            </w:pPr>
-          </w:p>
-        </w:tc>
-      </w:tr>
-      <w:tr>
-        <w:tc>
-          <w:tcPr>
-            <w:tcW w:w="1555" w:type="dxa"/>
-          </w:tcPr>
-          <w:p>
-            <w:pPr>
-              <w:spacing w:line="276" w:lineRule="auto"/>
-              <w:rPr>
-                <w:b/>
-                <w:bCs/>
-                <w:color w:val="000000"/>
-              </w:rPr>
-            </w:pPr>
-          </w:p>
-        </w:tc>
-        <w:tc>
-          <w:tcPr>
-            <w:tcW w:w="6237" w:type="dxa"/>
-          </w:tcPr>
-          <w:p>
-            <w:pPr>
-              <w:spacing w:line="276" w:lineRule="auto"/>
-              <w:rPr>
-                <w:b/>
-                <w:bCs/>
-                <w:color w:val="000000"/>
-              </w:rPr>
-            </w:pPr>
-          </w:p>
-        </w:tc>
-        <w:tc>
-          <w:tcPr>
-            <w:tcW w:w="2208" w:type="dxa"/>
-          </w:tcPr>
-          <w:p>
-            <w:pPr>
-              <w:spacing w:line="276" w:lineRule="auto"/>
-              <w:rPr>
-                <w:b/>
-                <w:bCs/>
-                <w:color w:val="000000"/>
-              </w:rPr>
-            </w:pPr>
-          </w:p>
-        </w:tc>
-      </w:tr>
-      <w:tr>
-        <w:tc>
-          <w:tcPr>
-            <w:tcW w:w="1555" w:type="dxa"/>
-          </w:tcPr>
-          <w:p>
-            <w:pPr>
-              <w:spacing w:line="276" w:lineRule="auto"/>
-              <w:rPr>
-                <w:b/>
-                <w:bCs/>
-                <w:color w:val="000000"/>
-              </w:rPr>
-            </w:pPr>
-          </w:p>
-        </w:tc>
-        <w:tc>
-          <w:tcPr>
-            <w:tcW w:w="6237" w:type="dxa"/>
-          </w:tcPr>
-          <w:p>
-            <w:pPr>
-              <w:spacing w:line="276" w:lineRule="auto"/>
-              <w:rPr>
-                <w:b/>
-                <w:bCs/>
-                <w:color w:val="000000"/>
-              </w:rPr>
-            </w:pPr>
-          </w:p>
-        </w:tc>
-        <w:tc>
-          <w:tcPr>
-            <w:tcW w:w="2208" w:type="dxa"/>
-          </w:tcPr>
-          <w:p>
-            <w:pPr>
-              <w:spacing w:line="276" w:lineRule="auto"/>
-              <w:rPr>
-                <w:b/>
-                <w:bCs/>
-                <w:color w:val="000000"/>
-              </w:rPr>
-            </w:pPr>
-          </w:p>
-        </w:tc>
-      </w:tr>
-      <w:tr>
-        <w:tc>
-          <w:tcPr>
-            <w:tcW w:w="1555" w:type="dxa"/>
-          </w:tcPr>
-          <w:p>
-            <w:pPr>
-              <w:spacing w:line="276" w:lineRule="auto"/>
-              <w:rPr>
-                <w:b/>
-                <w:bCs/>
-                <w:color w:val="000000"/>
-              </w:rPr>
-            </w:pPr>
-          </w:p>
-        </w:tc>
-        <w:tc>
-          <w:tcPr>
-            <w:tcW w:w="6237" w:type="dxa"/>
-          </w:tcPr>
-          <w:p>
-            <w:pPr>
-              <w:spacing w:line="276" w:lineRule="auto"/>
-              <w:rPr>
-                <w:b/>
-                <w:bCs/>
-                <w:color w:val="000000"/>
-              </w:rPr>
-            </w:pPr>
-          </w:p>
-        </w:tc>
-        <w:tc>
-          <w:tcPr>
-            <w:tcW w:w="2208" w:type="dxa"/>
-          </w:tcPr>
-          <w:p>
-            <w:pPr>
-              <w:spacing w:line="276" w:lineRule="auto"/>
-              <w:rPr>
-                <w:b/>
-                <w:bCs/>
-                <w:color w:val="000000"/>
-              </w:rPr>
-            </w:pPr>
-          </w:p>
-        </w:tc>
-      </w:tr>
-      <w:tr>
-        <w:tc>
-          <w:tcPr>
-            <w:tcW w:w="1555" w:type="dxa"/>
-          </w:tcPr>
-          <w:p>
-            <w:pPr>
-              <w:spacing w:line="276" w:lineRule="auto"/>
-              <w:rPr>
-                <w:b/>
-                <w:bCs/>
-                <w:color w:val="000000"/>
-              </w:rPr>
-            </w:pPr>
-          </w:p>
-        </w:tc>
-        <w:tc>
-          <w:tcPr>
-            <w:tcW w:w="6237" w:type="dxa"/>
-          </w:tcPr>
-          <w:p>
-            <w:pPr>
-              <w:spacing w:line="276" w:lineRule="auto"/>
-              <w:rPr>
-                <w:b/>
-                <w:bCs/>
-                <w:color w:val="000000"/>
-              </w:rPr>
-            </w:pPr>
-          </w:p>
-        </w:tc>
-        <w:tc>
-          <w:tcPr>
-            <w:tcW w:w="2208" w:type="dxa"/>
-          </w:tcPr>
-          <w:p>
-            <w:pPr>
-              <w:spacing w:line="276" w:lineRule="auto"/>
-              <w:rPr>
-                <w:b/>
-                <w:bCs/>
-                <w:color w:val="000000"/>
-              </w:rPr>
-            </w:pPr>
-          </w:p>
-        </w:tc>
-      </w:tr>
-      <w:tr>
-        <w:tc>
-          <w:tcPr>
-            <w:tcW w:w="1555" w:type="dxa"/>
-          </w:tcPr>
-          <w:p>
-            <w:pPr>
-              <w:spacing w:line="276" w:lineRule="auto"/>
-              <w:rPr>
-                <w:b/>
-                <w:bCs/>
-                <w:color w:val="000000"/>
-              </w:rPr>
-            </w:pPr>
-          </w:p>
-        </w:tc>
-        <w:tc>
-          <w:tcPr>
-            <w:tcW w:w="6237" w:type="dxa"/>
-          </w:tcPr>
-          <w:p>
-            <w:pPr>
-              <w:spacing w:line="276" w:lineRule="auto"/>
-              <w:rPr>
-                <w:b/>
-                <w:bCs/>
-                <w:color w:val="000000"/>
-              </w:rPr>
-            </w:pPr>
-          </w:p>
-        </w:tc>
-        <w:tc>
-          <w:tcPr>
-            <w:tcW w:w="2208" w:type="dxa"/>
-          </w:tcPr>
-          <w:p>
-            <w:pPr>
-              <w:spacing w:line="276" w:lineRule="auto"/>
-              <w:rPr>
-                <w:b/>
-                <w:bCs/>
-                <w:color w:val="000000"/>
-              </w:rPr>
-            </w:pPr>
-          </w:p>
-        </w:tc>
-      </w:tr>
-      <w:tr>
-        <w:tc>
-          <w:tcPr>
-            <w:tcW w:w="1555" w:type="dxa"/>
-          </w:tcPr>
-          <w:p>
-            <w:pPr>
-              <w:spacing w:line="276" w:lineRule="auto"/>
-              <w:rPr>
-                <w:b/>
-                <w:bCs/>
-                <w:color w:val="000000"/>
-              </w:rPr>
-            </w:pPr>
-          </w:p>
-        </w:tc>
-        <w:tc>
-          <w:tcPr>
-            <w:tcW w:w="6237" w:type="dxa"/>
-          </w:tcPr>
-          <w:p>
-            <w:pPr>
-              <w:spacing w:line="276" w:lineRule="auto"/>
-              <w:rPr>
-                <w:b/>
-                <w:bCs/>
-                <w:color w:val="000000"/>
-              </w:rPr>
-            </w:pPr>
-          </w:p>
-        </w:tc>
-        <w:tc>
-          <w:tcPr>
-            <w:tcW w:w="2208" w:type="dxa"/>
-          </w:tcPr>
-          <w:p>
-            <w:pPr>
-              <w:spacing w:line="276" w:lineRule="auto"/>
-              <w:rPr>
-                <w:b/>
-                <w:bCs/>
-                <w:color w:val="000000"/>
-              </w:rPr>
-            </w:pPr>
-          </w:p>
-        </w:tc>
-      </w:tr>
-      <w:tr>
-        <w:tc>
-          <w:tcPr>
-            <w:tcW w:w="1555" w:type="dxa"/>
-          </w:tcPr>
-          <w:p>
-            <w:pPr>
-              <w:spacing w:line="276" w:lineRule="auto"/>
-              <w:rPr>
-                <w:b/>
-                <w:bCs/>
-                <w:color w:val="000000"/>
-              </w:rPr>
-            </w:pPr>
-          </w:p>
-        </w:tc>
-        <w:tc>
-          <w:tcPr>
-            <w:tcW w:w="6237" w:type="dxa"/>
-          </w:tcPr>
-          <w:p>
-            <w:pPr>
-              <w:spacing w:line="276" w:lineRule="auto"/>
-              <w:rPr>
-                <w:b/>
-                <w:bCs/>
-                <w:color w:val="000000"/>
-              </w:rPr>
-            </w:pPr>
-          </w:p>
-        </w:tc>
-        <w:tc>
-          <w:tcPr>
-            <w:tcW w:w="2208" w:type="dxa"/>
-          </w:tcPr>
-          <w:p>
-            <w:pPr>
-              <w:spacing w:line="276" w:lineRule="auto"/>
-              <w:rPr>
-                <w:b/>
-                <w:bCs/>
-                <w:color w:val="000000"/>
-              </w:rPr>
-            </w:pPr>
-          </w:p>
-        </w:tc>
-      </w:tr>
-      <w:tr>
-        <w:tc>
-          <w:tcPr>
-            <w:tcW w:w="1555" w:type="dxa"/>
-          </w:tcPr>
-          <w:p>
-            <w:pPr>
-              <w:spacing w:line="276" w:lineRule="auto"/>
-              <w:rPr>
-                <w:b/>
-                <w:bCs/>
-                <w:color w:val="000000"/>
-              </w:rPr>
-            </w:pPr>
-          </w:p>
-        </w:tc>
-        <w:tc>
-          <w:tcPr>
-            <w:tcW w:w="6237" w:type="dxa"/>
-          </w:tcPr>
-          <w:p>
-            <w:pPr>
-              <w:spacing w:line="276" w:lineRule="auto"/>
-              <w:rPr>
-                <w:b/>
-                <w:bCs/>
-                <w:color w:val="000000"/>
-              </w:rPr>
-            </w:pPr>
-          </w:p>
-        </w:tc>
-        <w:tc>
-          <w:tcPr>
-            <w:tcW w:w="2208" w:type="dxa"/>
-          </w:tcPr>
-          <w:p>
-            <w:pPr>
-              <w:spacing w:line="276" w:lineRule="auto"/>
-              <w:rPr>
-                <w:b/>
-                <w:bCs/>
-                <w:color w:val="000000"/>
-              </w:rPr>
-            </w:pPr>
-          </w:p>
-        </w:tc>
-      </w:tr>
-      <w:tr>
-        <w:tc>
-          <w:tcPr>
-            <w:tcW w:w="1555" w:type="dxa"/>
-          </w:tcPr>
-          <w:p>
-            <w:pPr>
-              <w:spacing w:line="276" w:lineRule="auto"/>
-              <w:rPr>
-                <w:b/>
-                <w:bCs/>
-                <w:color w:val="000000"/>
-              </w:rPr>
-            </w:pPr>
-          </w:p>
-        </w:tc>
-        <w:tc>
-          <w:tcPr>
-            <w:tcW w:w="6237" w:type="dxa"/>
-          </w:tcPr>
-          <w:p>
-            <w:pPr>
-              <w:spacing w:line="276" w:lineRule="auto"/>
-              <w:rPr>
-                <w:b/>
-                <w:bCs/>
-                <w:color w:val="000000"/>
-              </w:rPr>
-            </w:pPr>
-          </w:p>
-        </w:tc>
-        <w:tc>
-          <w:tcPr>
-            <w:tcW w:w="2208" w:type="dxa"/>
-          </w:tcPr>
-          <w:p>
-            <w:pPr>
-              <w:spacing w:line="276" w:lineRule="auto"/>
-              <w:rPr>
-                <w:b/>
-                <w:bCs/>
-                <w:color w:val="000000"/>
-              </w:rPr>
-            </w:pPr>
-          </w:p>
-        </w:tc>
-      </w:tr>
-      <w:tr>
-        <w:tc>
-          <w:tcPr>
-            <w:tcW w:w="1555" w:type="dxa"/>
-          </w:tcPr>
-          <w:p>
-            <w:pPr>
-              <w:spacing w:line="276" w:lineRule="auto"/>
-              <w:rPr>
-                <w:b/>
-                <w:bCs/>
-                <w:color w:val="000000"/>
-              </w:rPr>
-            </w:pPr>
-          </w:p>
-        </w:tc>
-        <w:tc>
-          <w:tcPr>
-            <w:tcW w:w="6237" w:type="dxa"/>
-          </w:tcPr>
-          <w:p>
-            <w:pPr>
-              <w:spacing w:line="276" w:lineRule="auto"/>
-              <w:rPr>
-                <w:b/>
-                <w:bCs/>
-                <w:color w:val="000000"/>
-              </w:rPr>
-            </w:pPr>
-          </w:p>
-        </w:tc>
-        <w:tc>
-          <w:tcPr>
-            <w:tcW w:w="2208" w:type="dxa"/>
-          </w:tcPr>
-          <w:p>
-            <w:pPr>
-              <w:spacing w:line="276" w:lineRule="auto"/>
-              <w:rPr>
-                <w:b/>
-                <w:bCs/>
-                <w:color w:val="000000"/>
-              </w:rPr>
-            </w:pPr>
-          </w:p>
-        </w:tc>
-      </w:tr>
-      <w:tr>
-        <w:tc>
-          <w:tcPr>
-            <w:tcW w:w="1555" w:type="dxa"/>
-          </w:tcPr>
-          <w:p>
-            <w:pPr>
-              <w:spacing w:line="276" w:lineRule="auto"/>
-              <w:rPr>
-                <w:b/>
-                <w:bCs/>
-                <w:color w:val="000000"/>
-              </w:rPr>
-            </w:pPr>
-          </w:p>
-        </w:tc>
-        <w:tc>
-          <w:tcPr>
-            <w:tcW w:w="6237" w:type="dxa"/>
-          </w:tcPr>
-          <w:p>
-            <w:pPr>
-              <w:spacing w:line="276" w:lineRule="auto"/>
-              <w:rPr>
-                <w:b/>
-                <w:bCs/>
-                <w:color w:val="000000"/>
-              </w:rPr>
-            </w:pPr>
-          </w:p>
-        </w:tc>
-        <w:tc>
-          <w:tcPr>
-            <w:tcW w:w="2208" w:type="dxa"/>
-          </w:tcPr>
-          <w:p>
-            <w:pPr>
-              <w:spacing w:line="276" w:lineRule="auto"/>
-              <w:rPr>
-                <w:b/>
-                <w:bCs/>
-                <w:color w:val="000000"/>
-              </w:rPr>
-            </w:pPr>
-          </w:p>
-        </w:tc>
-      </w:tr>
-      <w:tr>
-        <w:tc>
-          <w:tcPr>
-            <w:tcW w:w="1555" w:type="dxa"/>
-          </w:tcPr>
-          <w:p>
-            <w:pPr>
-              <w:spacing w:line="276" w:lineRule="auto"/>
-              <w:rPr>
-                <w:b/>
-                <w:bCs/>
-                <w:color w:val="000000"/>
-              </w:rPr>
-            </w:pPr>
-          </w:p>
-        </w:tc>
-        <w:tc>
-          <w:tcPr>
-            <w:tcW w:w="6237" w:type="dxa"/>
-          </w:tcPr>
-          <w:p>
-            <w:pPr>
-              <w:spacing w:line="276" w:lineRule="auto"/>
-              <w:rPr>
-                <w:b/>
-                <w:bCs/>
-                <w:color w:val="000000"/>
-              </w:rPr>
-            </w:pPr>
-          </w:p>
-        </w:tc>
-        <w:tc>
-          <w:tcPr>
-            <w:tcW w:w="2208" w:type="dxa"/>
-          </w:tcPr>
-          <w:p>
-            <w:pPr>
-              <w:spacing w:line="276" w:lineRule="auto"/>
-              <w:rPr>
-                <w:b/>
-                <w:bCs/>
-                <w:color w:val="000000"/>
-              </w:rPr>
-            </w:pPr>
-          </w:p>
-        </w:tc>
-      </w:tr>
-      <w:tr>
-        <w:tc>
-          <w:tcPr>
-            <w:tcW w:w="1555" w:type="dxa"/>
-          </w:tcPr>
-          <w:p>
-            <w:pPr>
-              <w:spacing w:line="276" w:lineRule="auto"/>
-              <w:rPr>
-                <w:b/>
-                <w:bCs/>
-                <w:color w:val="000000"/>
-              </w:rPr>
-            </w:pPr>
-          </w:p>
-        </w:tc>
-        <w:tc>
-          <w:tcPr>
-            <w:tcW w:w="6237" w:type="dxa"/>
-          </w:tcPr>
-          <w:p>
-            <w:pPr>
-              <w:spacing w:line="276" w:lineRule="auto"/>
-              <w:rPr>
-                <w:b/>
-                <w:bCs/>
-                <w:color w:val="000000"/>
-              </w:rPr>
-            </w:pPr>
-          </w:p>
-        </w:tc>
-        <w:tc>
-          <w:tcPr>
-            <w:tcW w:w="2208" w:type="dxa"/>
-          </w:tcPr>
-          <w:p>
-            <w:pPr>
-              <w:spacing w:line="276" w:lineRule="auto"/>
-              <w:rPr>
-                <w:b/>
-                <w:bCs/>
-                <w:color w:val="000000"/>
-              </w:rPr>
-            </w:pPr>
-          </w:p>
-        </w:tc>
-      </w:tr>
-      <w:tr>
-        <w:tc>
-          <w:tcPr>
-            <w:tcW w:w="1555" w:type="dxa"/>
-          </w:tcPr>
-          <w:p>
-            <w:pPr>
-              <w:spacing w:line="276" w:lineRule="auto"/>
-              <w:rPr>
-                <w:b/>
-                <w:bCs/>
-                <w:color w:val="000000"/>
-              </w:rPr>
-            </w:pPr>
-          </w:p>
-        </w:tc>
-        <w:tc>
-          <w:tcPr>
-            <w:tcW w:w="6237" w:type="dxa"/>
-          </w:tcPr>
-          <w:p>
-            <w:pPr>
-              <w:spacing w:line="276" w:lineRule="auto"/>
-              <w:rPr>
-                <w:b/>
-                <w:bCs/>
-                <w:color w:val="000000"/>
-              </w:rPr>
-            </w:pPr>
-          </w:p>
-        </w:tc>
-        <w:tc>
-          <w:tcPr>
-            <w:tcW w:w="2208" w:type="dxa"/>
-          </w:tcPr>
-          <w:p>
-            <w:pPr>
-              <w:spacing w:line="276" w:lineRule="auto"/>
-              <w:rPr>
-                <w:b/>
-                <w:bCs/>
-                <w:color w:val="000000"/>
-              </w:rPr>
-            </w:pPr>
-          </w:p>
-        </w:tc>
-      </w:tr>
-      <w:tr>
-        <w:tc>
-          <w:tcPr>
-            <w:tcW w:w="1555" w:type="dxa"/>
-          </w:tcPr>
-          <w:p>
-            <w:pPr>
-              <w:spacing w:line="276" w:lineRule="auto"/>
-              <w:rPr>
-                <w:b/>
-                <w:bCs/>
-                <w:color w:val="000000"/>
-              </w:rPr>
-            </w:pPr>
-          </w:p>
-        </w:tc>
-        <w:tc>
-          <w:tcPr>
-            <w:tcW w:w="6237" w:type="dxa"/>
-          </w:tcPr>
-          <w:p>
-            <w:pPr>
-              <w:spacing w:line="276" w:lineRule="auto"/>
-              <w:rPr>
-                <w:b/>
-                <w:bCs/>
-                <w:color w:val="000000"/>
-              </w:rPr>
-            </w:pPr>
-          </w:p>
-        </w:tc>
-        <w:tc>
-          <w:tcPr>
-            <w:tcW w:w="2208" w:type="dxa"/>
-          </w:tcPr>
-          <w:p>
-            <w:pPr>
-              <w:spacing w:line="276" w:lineRule="auto"/>
-              <w:rPr>
-                <w:b/>
-                <w:bCs/>
-                <w:color w:val="000000"/>
-              </w:rPr>
-            </w:pPr>
-          </w:p>
-        </w:tc>
-      </w:tr>
-      <w:tr>
-        <w:tc>
-          <w:tcPr>
-            <w:tcW w:w="1555" w:type="dxa"/>
-          </w:tcPr>
-          <w:p>
-            <w:pPr>
-              <w:spacing w:line="276" w:lineRule="auto"/>
-              <w:rPr>
-                <w:b/>
-                <w:bCs/>
-                <w:color w:val="000000"/>
-              </w:rPr>
-            </w:pPr>
-          </w:p>
-        </w:tc>
-        <w:tc>
-          <w:tcPr>
-            <w:tcW w:w="6237" w:type="dxa"/>
-          </w:tcPr>
-          <w:p>
-            <w:pPr>
-              <w:spacing w:line="276" w:lineRule="auto"/>
-              <w:rPr>
-                <w:b/>
-                <w:bCs/>
-                <w:color w:val="000000"/>
-              </w:rPr>
-            </w:pPr>
-          </w:p>
-        </w:tc>
-        <w:tc>
-          <w:tcPr>
-            <w:tcW w:w="2208" w:type="dxa"/>
-          </w:tcPr>
-          <w:p>
-            <w:pPr>
-              <w:spacing w:line="276" w:lineRule="auto"/>
-              <w:rPr>
-                <w:b/>
-                <w:bCs/>
-                <w:color w:val="000000"/>
-              </w:rPr>
-            </w:pPr>
-          </w:p>
-        </w:tc>
-      </w:tr>
-      <w:tr>
-        <w:tc>
-          <w:tcPr>
-            <w:tcW w:w="1555" w:type="dxa"/>
-          </w:tcPr>
-          <w:p>
-            <w:pPr>
-              <w:spacing w:line="276" w:lineRule="auto"/>
-              <w:rPr>
-                <w:b/>
-                <w:bCs/>
-                <w:color w:val="000000"/>
-              </w:rPr>
-            </w:pPr>
-          </w:p>
-        </w:tc>
-        <w:tc>
-          <w:tcPr>
-            <w:tcW w:w="6237" w:type="dxa"/>
-          </w:tcPr>
-          <w:p>
-            <w:pPr>
-              <w:spacing w:line="276" w:lineRule="auto"/>
-              <w:rPr>
-                <w:b/>
-                <w:bCs/>
-                <w:color w:val="000000"/>
-              </w:rPr>
-            </w:pPr>
-          </w:p>
-        </w:tc>
-        <w:tc>
-          <w:tcPr>
-            <w:tcW w:w="2208" w:type="dxa"/>
-          </w:tcPr>
-          <w:p>
-            <w:pPr>
-              <w:spacing w:line="276" w:lineRule="auto"/>
-              <w:rPr>
-                <w:b/>
-                <w:bCs/>
-                <w:color w:val="000000"/>
-              </w:rPr>
-            </w:pPr>
-          </w:p>
-        </w:tc>
-      </w:tr>
-    </w:tbl>
-    <w:p>
-      <w:pPr>
-        <w:spacing w:after="0" w:line="240" w:lineRule="auto"/>
-        <w:rPr>
-          <w:b/>
-          <w:bCs/>
-          <w:color w:val="000000"/>
-          <w:sz w:val="28"/>
-          <w:szCs w:val="28"/>
-        </w:rPr>
-      </w:pPr>
-    </w:p>
     <w:sectPr>
       <w:headerReference w:type="default" r:id="rId7"/>
       <w:footerReference w:type="default" r:id="rId8"/>

</xml_diff>